<commit_message>
Alignment is justified and some correction in Education & Professional Experiences...
</commit_message>
<xml_diff>
--- a/assets/img/organisation/Banners.docx
+++ b/assets/img/organisation/Banners.docx
@@ -422,6 +422,183 @@
     <w:p/>
     <w:p/>
     <w:p/>
+    <w:p/>
+    <w:p>
+      <w:r>
+        <w:rPr>
+          <w:noProof/>
+          <w:lang w:eastAsia="en-AU"/>
+        </w:rPr>
+        <w:lastRenderedPageBreak/>
+        <w:drawing>
+          <wp:inline distT="0" distB="0" distL="0" distR="0" wp14:anchorId="5DB2D865" wp14:editId="31248B9C">
+            <wp:extent cx="1914525" cy="1914525"/>
+            <wp:effectExtent l="0" t="0" r="9525" b="9525"/>
+            <wp:docPr id="6" name="Picture 6" descr="C:\Users\aliem\AppData\Local\Microsoft\Windows\INetCache\Content.Word\du.png"/>
+            <wp:cNvGraphicFramePr>
+              <a:graphicFrameLocks xmlns:a="http://schemas.openxmlformats.org/drawingml/2006/main" noChangeAspect="1"/>
+            </wp:cNvGraphicFramePr>
+            <a:graphic xmlns:a="http://schemas.openxmlformats.org/drawingml/2006/main">
+              <a:graphicData uri="http://schemas.openxmlformats.org/drawingml/2006/picture">
+                <pic:pic xmlns:pic="http://schemas.openxmlformats.org/drawingml/2006/picture">
+                  <pic:nvPicPr>
+                    <pic:cNvPr id="0" name="Picture 29" descr="C:\Users\aliem\AppData\Local\Microsoft\Windows\INetCache\Content.Word\du.png"/>
+                    <pic:cNvPicPr>
+                      <a:picLocks noChangeAspect="1" noChangeArrowheads="1"/>
+                    </pic:cNvPicPr>
+                  </pic:nvPicPr>
+                  <pic:blipFill>
+                    <a:blip r:embed="rId11" cstate="print">
+                      <a:extLst>
+                        <a:ext uri="{28A0092B-C50C-407E-A947-70E740481C1C}">
+                          <a14:useLocalDpi xmlns:a14="http://schemas.microsoft.com/office/drawing/2010/main" val="0"/>
+                        </a:ext>
+                      </a:extLst>
+                    </a:blip>
+                    <a:srcRect/>
+                    <a:stretch>
+                      <a:fillRect/>
+                    </a:stretch>
+                  </pic:blipFill>
+                  <pic:spPr bwMode="auto">
+                    <a:xfrm>
+                      <a:off x="0" y="0"/>
+                      <a:ext cx="1914525" cy="1914525"/>
+                    </a:xfrm>
+                    <a:prstGeom prst="rect">
+                      <a:avLst/>
+                    </a:prstGeom>
+                    <a:noFill/>
+                    <a:ln>
+                      <a:noFill/>
+                    </a:ln>
+                  </pic:spPr>
+                </pic:pic>
+              </a:graphicData>
+            </a:graphic>
+          </wp:inline>
+        </w:drawing>
+      </w:r>
+      <w:r>
+        <w:rPr>
+          <w:noProof/>
+          <w:lang w:eastAsia="en-AU"/>
+        </w:rPr>
+        <w:drawing>
+          <wp:inline distT="0" distB="0" distL="0" distR="0" wp14:anchorId="620CAF3E" wp14:editId="1BABD9FB">
+            <wp:extent cx="3876675" cy="1200150"/>
+            <wp:effectExtent l="0" t="0" r="9525" b="0"/>
+            <wp:docPr id="9" name="Picture 9" descr="C:\Users\aliem\AppData\Local\Microsoft\Windows\INetCache\Content.Word\mu.png"/>
+            <wp:cNvGraphicFramePr>
+              <a:graphicFrameLocks xmlns:a="http://schemas.openxmlformats.org/drawingml/2006/main" noChangeAspect="1"/>
+            </wp:cNvGraphicFramePr>
+            <a:graphic xmlns:a="http://schemas.openxmlformats.org/drawingml/2006/main">
+              <a:graphicData uri="http://schemas.openxmlformats.org/drawingml/2006/picture">
+                <pic:pic xmlns:pic="http://schemas.openxmlformats.org/drawingml/2006/picture">
+                  <pic:nvPicPr>
+                    <pic:cNvPr id="0" name="Picture 30" descr="C:\Users\aliem\AppData\Local\Microsoft\Windows\INetCache\Content.Word\mu.png"/>
+                    <pic:cNvPicPr>
+                      <a:picLocks noChangeAspect="1" noChangeArrowheads="1"/>
+                    </pic:cNvPicPr>
+                  </pic:nvPicPr>
+                  <pic:blipFill>
+                    <a:blip r:embed="rId12">
+                      <a:extLst>
+                        <a:ext uri="{28A0092B-C50C-407E-A947-70E740481C1C}">
+                          <a14:useLocalDpi xmlns:a14="http://schemas.microsoft.com/office/drawing/2010/main" val="0"/>
+                        </a:ext>
+                      </a:extLst>
+                    </a:blip>
+                    <a:srcRect/>
+                    <a:stretch>
+                      <a:fillRect/>
+                    </a:stretch>
+                  </pic:blipFill>
+                  <pic:spPr bwMode="auto">
+                    <a:xfrm>
+                      <a:off x="0" y="0"/>
+                      <a:ext cx="3876675" cy="1200150"/>
+                    </a:xfrm>
+                    <a:prstGeom prst="rect">
+                      <a:avLst/>
+                    </a:prstGeom>
+                    <a:noFill/>
+                    <a:ln>
+                      <a:noFill/>
+                    </a:ln>
+                  </pic:spPr>
+                </pic:pic>
+              </a:graphicData>
+            </a:graphic>
+          </wp:inline>
+        </w:drawing>
+      </w:r>
+      <w:bookmarkStart w:id="0" w:name="_GoBack"/>
+      <w:r>
+        <w:rPr>
+          <w:noProof/>
+          <w:lang w:eastAsia="en-AU"/>
+        </w:rPr>
+        <w:drawing>
+          <wp:inline distT="0" distB="0" distL="0" distR="0" wp14:anchorId="2AD640B6" wp14:editId="787D4760">
+            <wp:extent cx="1915200" cy="1915200"/>
+            <wp:effectExtent l="0" t="0" r="8890" b="8890"/>
+            <wp:docPr id="10" name="Picture 10"/>
+            <wp:cNvGraphicFramePr>
+              <a:graphicFrameLocks xmlns:a="http://schemas.openxmlformats.org/drawingml/2006/main" noChangeAspect="1"/>
+            </wp:cNvGraphicFramePr>
+            <a:graphic xmlns:a="http://schemas.openxmlformats.org/drawingml/2006/main">
+              <a:graphicData uri="http://schemas.openxmlformats.org/drawingml/2006/picture">
+                <pic:pic xmlns:pic="http://schemas.openxmlformats.org/drawingml/2006/picture">
+                  <pic:nvPicPr>
+                    <pic:cNvPr id="0" name="Picture 32" descr="C:\Users\aliem\AppData\Local\Microsoft\Windows\INetCache\Content.Word\aetmos.png"/>
+                    <pic:cNvPicPr>
+                      <a:picLocks noChangeAspect="1" noChangeArrowheads="1"/>
+                    </pic:cNvPicPr>
+                  </pic:nvPicPr>
+                  <pic:blipFill>
+                    <a:blip r:embed="rId14">
+                      <a:extLst>
+                        <a:ext uri="{28A0092B-C50C-407E-A947-70E740481C1C}">
+                          <a14:useLocalDpi xmlns:a14="http://schemas.microsoft.com/office/drawing/2010/main" val="0"/>
+                        </a:ext>
+                      </a:extLst>
+                    </a:blip>
+                    <a:stretch>
+                      <a:fillRect/>
+                    </a:stretch>
+                  </pic:blipFill>
+                  <pic:spPr bwMode="auto">
+                    <a:xfrm>
+                      <a:off x="0" y="0"/>
+                      <a:ext cx="1915200" cy="1915200"/>
+                    </a:xfrm>
+                    <a:prstGeom prst="rect">
+                      <a:avLst/>
+                    </a:prstGeom>
+                    <a:noFill/>
+                    <a:ln>
+                      <a:noFill/>
+                    </a:ln>
+                  </pic:spPr>
+                </pic:pic>
+              </a:graphicData>
+            </a:graphic>
+          </wp:inline>
+        </w:drawing>
+      </w:r>
+      <w:bookmarkEnd w:id="0"/>
+    </w:p>
+    <w:p/>
+    <w:p/>
+    <w:p/>
+    <w:p/>
+    <w:p/>
+    <w:p/>
+    <w:p/>
+    <w:p/>
+    <w:p/>
+    <w:p/>
     <w:p>
       <w:r>
         <w:rPr>
@@ -532,8 +709,6 @@
           </wp:inline>
         </w:drawing>
       </w:r>
-      <w:bookmarkStart w:id="0" w:name="_GoBack"/>
-      <w:bookmarkEnd w:id="0"/>
     </w:p>
     <w:p/>
     <w:p/>

</xml_diff>